<commit_message>
SambaSafety Inbound SDR: resume and cover letter reworked to lead with sales numbers
Co-Authored-By: Claude Opus 5.5 <noreply@anthropic.com>
Claude-Session: https://claude.ai/code/session_019LhRKac7SgLhLovfgJNC93
</commit_message>
<xml_diff>
--- a/applications/sambasafety-inbound-sdr/SambaSafety-InboundSDR-Resume.docx
+++ b/applications/sambasafety-inbound-sdr/SambaSafety-InboundSDR-Resume.docx
@@ -31,7 +31,7 @@
           <w:color w:val="555555"/>
           <w:sz w:val="23"/>
         </w:rPr>
-        <w:t>Inbound Sales Development | Lead Qualification, Speed-to-Lead, Meeting Booking &amp; Salesforce</w:t>
+        <w:t>Sales Development &amp; SaaS Sales | Quota Overachiever, Lead Qualification, Meeting Booking &amp; Salesforce</w:t>
       </w:r>
     </w:p>
     <w:p>
@@ -80,7 +80,7 @@
           <w:i w:val="0"/>
           <w:color w:val="1A1A1A"/>
         </w:rPr>
-        <w:t>Software sales professional who qualifies fast and books meetings that hold. Four years as a BDR booking sales-ready meetings for regional reps, then SaaS sales at Fivestars (up to 150 calls a day, up to 10 deals a month) and Accelo (top three on a team of 8 to 15 while quota doubled). Builds automated lead capture and follow-up systems, so I know what fast, consistent inbound response looks like. Works in Salesforce, HubSpot, ZoomInfo, Salesloft, and Apollo.</w:t>
+        <w:t>Software sales professional with a track record of beating quota: 120% of sales target at Wix, top three on a team of 8 to 15 at Accelo while quota roughly doubled (~$213K/year in services bookings), up to 10 deals a month on up to 150 calls a day at Fivestars, and ~$130K+ in bookings from 6 deals at Fetch &amp; Funnel. Started as a BDR booking sales-ready meetings for four years. Works in Salesforce, HubSpot, ZoomInfo, Salesloft, and Apollo.</w:t>
       </w:r>
     </w:p>
     <w:p>
@@ -177,31 +177,7 @@
           <w:i w:val="0"/>
           <w:color w:val="1A1A1A"/>
         </w:rPr>
-        <w:t>Built automated lead capture, tagging, routing, and qualification workflows in GoHighLevel so every inbound lead gets an immediate response and a next step.</w:t>
-      </w:r>
-    </w:p>
-    <w:p>
-      <w:pPr>
-        <w:spacing w:after="30"/>
-        <w:ind w:left="259" w:hanging="259"/>
-      </w:pPr>
-      <w:r>
-        <w:rPr>
-          <w:rFonts w:ascii="Calibri" w:hAnsi="Calibri"/>
-          <w:b w:val="0"/>
-          <w:i w:val="0"/>
-          <w:color w:val="163A5F"/>
-        </w:rPr>
-        <w:t xml:space="preserve">•  </w:t>
-      </w:r>
-      <w:r>
-        <w:rPr>
-          <w:rFonts w:ascii="Calibri" w:hAnsi="Calibri"/>
-          <w:b w:val="0"/>
-          <w:i w:val="0"/>
-          <w:color w:val="1A1A1A"/>
-        </w:rPr>
-        <w:t>Run my own outbound pipeline end to end, from first touch to booked meeting, with segmented email sequences by trigger.</w:t>
+        <w:t>Built and run my own outbound and lead-response system: a free audit offer enrolled 180+ businesses and converted 2 to paying clients, with automated capture, routing, and follow-up.</w:t>
       </w:r>
     </w:p>
     <w:p>
@@ -279,7 +255,7 @@
           <w:i w:val="0"/>
           <w:color w:val="1A1A1A"/>
         </w:rPr>
-        <w:t>Managed accounts at $20K+/month in ad spend and built reporting on lead flow, CAC, and conversion to show which campaigns produced quality leads.</w:t>
+        <w:t>Managed accounts at $20K+/month in ad spend and reported which campaigns produced quality leads and pipeline.</w:t>
       </w:r>
     </w:p>
     <w:p>
@@ -357,7 +333,7 @@
           <w:i w:val="0"/>
           <w:color w:val="1A1A1A"/>
         </w:rPr>
-        <w:t>Sold and onboarded 15-20 reseller partners (deals ~$10K-$45K) across 50+ activities a day, retaining all but one, tracking pipeline in Salesforce.</w:t>
+        <w:t>Signed and onboarded 15-20 reseller partners (deals ~$10K-$45K) across 50+ activities a day, retaining all but one, tracking pipeline in Salesforce.</w:t>
       </w:r>
     </w:p>
     <w:p>
@@ -435,7 +411,7 @@
           <w:i w:val="0"/>
           <w:color w:val="1A1A1A"/>
         </w:rPr>
-        <w:t>Closed 6 new-client deals averaging ~$22K (~$130K+ total bookings) and led the sales team.</w:t>
+        <w:t>Closed 6 new-client deals averaging ~$22K (several $25K+), ~$130K+ in total bookings, while leading the sales team.</w:t>
       </w:r>
     </w:p>
     <w:p>
@@ -513,7 +489,7 @@
           <w:i w:val="0"/>
           <w:color w:val="1A1A1A"/>
         </w:rPr>
-        <w:t>Hit 120% of sales targets and 110% of implementation targets while onboarding 25+ clients per month.</w:t>
+        <w:t>Hit 120% of sales targets (and 110% of implementation targets) while onboarding 25+ clients per month.</w:t>
       </w:r>
     </w:p>
     <w:p>
@@ -591,7 +567,31 @@
           <w:i w:val="0"/>
           <w:color w:val="1A1A1A"/>
         </w:rPr>
-        <w:t>Ranked top three in sales on a team of 8 to 15 reps for most of a 27-month tenure while quota roughly doubled, with deals of $20K+.</w:t>
+        <w:t>Ranked top three in sales on a team of 8 to 15 reps for most of a 27-month tenure while quota roughly doubled.</w:t>
+      </w:r>
+    </w:p>
+    <w:p>
+      <w:pPr>
+        <w:spacing w:after="30"/>
+        <w:ind w:left="259" w:hanging="259"/>
+      </w:pPr>
+      <w:r>
+        <w:rPr>
+          <w:rFonts w:ascii="Calibri" w:hAnsi="Calibri"/>
+          <w:b w:val="0"/>
+          <w:i w:val="0"/>
+          <w:color w:val="163A5F"/>
+        </w:rPr>
+        <w:t xml:space="preserve">•  </w:t>
+      </w:r>
+      <w:r>
+        <w:rPr>
+          <w:rFonts w:ascii="Calibri" w:hAnsi="Calibri"/>
+          <w:b w:val="0"/>
+          <w:i w:val="0"/>
+          <w:color w:val="1A1A1A"/>
+        </w:rPr>
+        <w:t>Averaged ~$17,750/month in implementation and services bookings (~$213K annualized) plus new recurring revenue, consistently in accelerator commission tiers, with deals of $20K+.</w:t>
       </w:r>
     </w:p>
     <w:p>
@@ -780,7 +780,7 @@
           <w:i w:val="0"/>
           <w:color w:val="1A1A1A"/>
         </w:rPr>
-        <w:t xml:space="preserve">Sales Development:  </w:t>
+        <w:t xml:space="preserve">Sales:  </w:t>
       </w:r>
       <w:r>
         <w:rPr>
@@ -789,30 +789,7 @@
           <w:i w:val="0"/>
           <w:color w:val="1A1A1A"/>
         </w:rPr>
-        <w:t>Inbound Lead Qualification, Needs Discovery, Speed-to-Lead &amp; Follow-Up, Meeting Booking, Lead Nurture</w:t>
-      </w:r>
-    </w:p>
-    <w:p>
-      <w:pPr>
-        <w:spacing w:after="30"/>
-      </w:pPr>
-      <w:r>
-        <w:rPr>
-          <w:rFonts w:ascii="Calibri" w:hAnsi="Calibri"/>
-          <w:b/>
-          <w:i w:val="0"/>
-          <w:color w:val="1A1A1A"/>
-        </w:rPr>
-        <w:t xml:space="preserve">Tools:  </w:t>
-      </w:r>
-      <w:r>
-        <w:rPr>
-          <w:rFonts w:ascii="Calibri" w:hAnsi="Calibri"/>
-          <w:b w:val="0"/>
-          <w:i w:val="0"/>
-          <w:color w:val="1A1A1A"/>
-        </w:rPr>
-        <w:t>Salesforce, HubSpot, ZoomInfo, Salesloft, Apollo</w:t>
+        <w:t>Inbound Qualification &amp; Discovery, Speed-to-Lead, Meeting Booking, Lead Nurture, Salesforce, HubSpot, ZoomInfo, Salesloft, Apollo</w:t>
       </w:r>
     </w:p>
     <w:p>

</xml_diff>